<commit_message>
Reconcile Table 2 canonical metrics with manifest counts, remove Apart Research affiliation, and update report generation docs
</commit_message>
<xml_diff>
--- a/report/when_correlation_lies_report.docx
+++ b/report/when_correlation_lies_report.docx
@@ -52,7 +52,7 @@
           <w:i/>
           <w:sz w:val="18"/>
         </w:rPr>
-        <w:t>Independent Researcher  |  With Apart Research</w:t>
+        <w:t>Independent Researcher</w:t>
         <w:br/>
       </w:r>
       <w:r>
@@ -1390,7 +1390,7 @@
           <w:rFonts w:ascii="Old Standard TT" w:hAnsi="Old Standard TT"/>
           <w:sz w:val="18"/>
         </w:rPr>
-        <w:t>Table 2 reports the primary benchmark results across 260 unique trajectories (54,000 recorded rounds across 300 evaluations) at T=200 rounds. Under Condition B, Marginal MI exhibits a 38-fold surge from 0.025 to 0.958 bits, suffering a 100% False Positive Rate (FPR = 1.000). Conditioning on state S in CMI drops dependence to 0.084 bits, completely eliminating false positives (FPR = 0.000). Under Condition C, PNI achieves 100% Top-1 ranking accuracy (Wilson 95% CI: [0.839, 1.000], MRR = 1.000).</w:t>
+        <w:t>Table 2 reports the primary benchmark results across 260 unique trajectories (54,000 recorded rounds across 300 evaluations) at T=200 rounds. Under Condition B (shared-context confounding), unconditioned Marginal MI exhibits a 38-fold surge from 0.025 to 0.958 bits [0.932, 0.984], falsely flagging 100% of non-coordinating pairs as colluders (FPR = 1.000, 120/120 pairs). Conditioning on observable state S in CMI drops dependence to 0.084 bits [0.081, 0.087], completely eliminating false positives (FPR = 0.000, 0/120 pairs). Under Condition C (shared-private-signal coordination), PNI achieves 100% Top-1 ranking accuracy (20/20 seeds, Wilson 95% CI: [0.839, 1.000], MRR = 1.000), with true coordinating pairs achieving an average net score of 0.755 bits [0.741, 0.769]. Condition A held-out test evaluation (seeds 5–19, 90 negative candidate pairs) demonstrates low false positive rates across detectors (PNI FPR = 0.022, 2/90; Marginal MI FPR = 0.033, 3/90; CMI FPR = 0.111, 10/90).</w:t>
       </w:r>
     </w:p>
     <w:tbl>
@@ -1423,7 +1423,7 @@
         </w:trPr>
         <w:tc>
           <w:tcPr>
-            <w:tcW w:type="dxa" w:w="1584"/>
+            <w:tcW w:type="dxa" w:w="1656"/>
             <w:shd w:fill="1F3A52"/>
             <w:tcMar>
               <w:top w:w="50" w:type="dxa"/>
@@ -1442,9 +1442,117 @@
                 <w:rFonts w:ascii="Old Standard TT" w:hAnsi="Old Standard TT"/>
                 <w:b/>
                 <w:color w:val="FFFFFF"/>
-                <w:sz w:val="14"/>
+                <w:sz w:val="13"/>
               </w:rPr>
               <w:t>Condition</w:t>
+            </w:r>
+          </w:p>
+        </w:tc>
+        <w:tc>
+          <w:tcPr>
+            <w:tcW w:type="dxa" w:w="1368"/>
+            <w:shd w:fill="1F3A52"/>
+            <w:tcMar>
+              <w:top w:w="50" w:type="dxa"/>
+              <w:bottom w:w="50" w:type="dxa"/>
+              <w:left w:w="50" w:type="dxa"/>
+              <w:right w:w="50" w:type="dxa"/>
+            </w:tcMar>
+          </w:tcPr>
+          <w:p>
+            <w:pPr>
+              <w:spacing w:before="0" w:after="0" w:line="240" w:lineRule="auto"/>
+              <w:jc w:val="right"/>
+            </w:pPr>
+            <w:r>
+              <w:rPr>
+                <w:rFonts w:ascii="Old Standard TT" w:hAnsi="Old Standard TT"/>
+                <w:b/>
+                <w:color w:val="FFFFFF"/>
+                <w:sz w:val="13"/>
+              </w:rPr>
+              <w:t>Marginal MI Top Score</w:t>
+            </w:r>
+          </w:p>
+        </w:tc>
+        <w:tc>
+          <w:tcPr>
+            <w:tcW w:type="dxa" w:w="1512"/>
+            <w:shd w:fill="1F3A52"/>
+            <w:tcMar>
+              <w:top w:w="50" w:type="dxa"/>
+              <w:bottom w:w="50" w:type="dxa"/>
+              <w:left w:w="50" w:type="dxa"/>
+              <w:right w:w="50" w:type="dxa"/>
+            </w:tcMar>
+          </w:tcPr>
+          <w:p>
+            <w:pPr>
+              <w:spacing w:before="0" w:after="0" w:line="240" w:lineRule="auto"/>
+              <w:jc w:val="right"/>
+            </w:pPr>
+            <w:r>
+              <w:rPr>
+                <w:rFonts w:ascii="Old Standard TT" w:hAnsi="Old Standard TT"/>
+                <w:b/>
+                <w:color w:val="FFFFFF"/>
+                <w:sz w:val="13"/>
+              </w:rPr>
+              <w:t>Marginal MI FPR [Counts]</w:t>
+            </w:r>
+          </w:p>
+        </w:tc>
+        <w:tc>
+          <w:tcPr>
+            <w:tcW w:type="dxa" w:w="1368"/>
+            <w:shd w:fill="1F3A52"/>
+            <w:tcMar>
+              <w:top w:w="50" w:type="dxa"/>
+              <w:bottom w:w="50" w:type="dxa"/>
+              <w:left w:w="50" w:type="dxa"/>
+              <w:right w:w="50" w:type="dxa"/>
+            </w:tcMar>
+          </w:tcPr>
+          <w:p>
+            <w:pPr>
+              <w:spacing w:before="0" w:after="0" w:line="240" w:lineRule="auto"/>
+              <w:jc w:val="right"/>
+            </w:pPr>
+            <w:r>
+              <w:rPr>
+                <w:rFonts w:ascii="Old Standard TT" w:hAnsi="Old Standard TT"/>
+                <w:b/>
+                <w:color w:val="FFFFFF"/>
+                <w:sz w:val="13"/>
+              </w:rPr>
+              <w:t>CMI Top Score</w:t>
+            </w:r>
+          </w:p>
+        </w:tc>
+        <w:tc>
+          <w:tcPr>
+            <w:tcW w:type="dxa" w:w="1512"/>
+            <w:shd w:fill="1F3A52"/>
+            <w:tcMar>
+              <w:top w:w="50" w:type="dxa"/>
+              <w:bottom w:w="50" w:type="dxa"/>
+              <w:left w:w="50" w:type="dxa"/>
+              <w:right w:w="50" w:type="dxa"/>
+            </w:tcMar>
+          </w:tcPr>
+          <w:p>
+            <w:pPr>
+              <w:spacing w:before="0" w:after="0" w:line="240" w:lineRule="auto"/>
+              <w:jc w:val="right"/>
+            </w:pPr>
+            <w:r>
+              <w:rPr>
+                <w:rFonts w:ascii="Old Standard TT" w:hAnsi="Old Standard TT"/>
+                <w:b/>
+                <w:color w:val="FFFFFF"/>
+                <w:sz w:val="13"/>
+              </w:rPr>
+              <w:t>CMI FPR [Counts]</w:t>
             </w:r>
           </w:p>
         </w:tc>
@@ -1469,15 +1577,15 @@
                 <w:rFonts w:ascii="Old Standard TT" w:hAnsi="Old Standard TT"/>
                 <w:b/>
                 <w:color w:val="FFFFFF"/>
-                <w:sz w:val="14"/>
-              </w:rPr>
-              <w:t>Marginal MI Top Score</w:t>
-            </w:r>
-          </w:p>
-        </w:tc>
-        <w:tc>
-          <w:tcPr>
-            <w:tcW w:type="dxa" w:w="1584"/>
+                <w:sz w:val="13"/>
+              </w:rPr>
+              <w:t>PNI Top-1 Acc.</w:t>
+            </w:r>
+          </w:p>
+        </w:tc>
+        <w:tc>
+          <w:tcPr>
+            <w:tcW w:type="dxa" w:w="1368"/>
             <w:shd w:fill="1F3A52"/>
             <w:tcMar>
               <w:top w:w="50" w:type="dxa"/>
@@ -1496,117 +1604,9 @@
                 <w:rFonts w:ascii="Old Standard TT" w:hAnsi="Old Standard TT"/>
                 <w:b/>
                 <w:color w:val="FFFFFF"/>
-                <w:sz w:val="14"/>
-              </w:rPr>
-              <w:t>Marginal MI FPR</w:t>
-            </w:r>
-          </w:p>
-        </w:tc>
-        <w:tc>
-          <w:tcPr>
-            <w:tcW w:type="dxa" w:w="1440"/>
-            <w:shd w:fill="1F3A52"/>
-            <w:tcMar>
-              <w:top w:w="50" w:type="dxa"/>
-              <w:bottom w:w="50" w:type="dxa"/>
-              <w:left w:w="50" w:type="dxa"/>
-              <w:right w:w="50" w:type="dxa"/>
-            </w:tcMar>
-          </w:tcPr>
-          <w:p>
-            <w:pPr>
-              <w:spacing w:before="0" w:after="0" w:line="240" w:lineRule="auto"/>
-              <w:jc w:val="right"/>
-            </w:pPr>
-            <w:r>
-              <w:rPr>
-                <w:rFonts w:ascii="Old Standard TT" w:hAnsi="Old Standard TT"/>
-                <w:b/>
-                <w:color w:val="FFFFFF"/>
-                <w:sz w:val="14"/>
-              </w:rPr>
-              <w:t>CMI Top Score</w:t>
-            </w:r>
-          </w:p>
-        </w:tc>
-        <w:tc>
-          <w:tcPr>
-            <w:tcW w:type="dxa" w:w="1584"/>
-            <w:shd w:fill="1F3A52"/>
-            <w:tcMar>
-              <w:top w:w="50" w:type="dxa"/>
-              <w:bottom w:w="50" w:type="dxa"/>
-              <w:left w:w="50" w:type="dxa"/>
-              <w:right w:w="50" w:type="dxa"/>
-            </w:tcMar>
-          </w:tcPr>
-          <w:p>
-            <w:pPr>
-              <w:spacing w:before="0" w:after="0" w:line="240" w:lineRule="auto"/>
-              <w:jc w:val="right"/>
-            </w:pPr>
-            <w:r>
-              <w:rPr>
-                <w:rFonts w:ascii="Old Standard TT" w:hAnsi="Old Standard TT"/>
-                <w:b/>
-                <w:color w:val="FFFFFF"/>
-                <w:sz w:val="14"/>
-              </w:rPr>
-              <w:t>CMI FPR</w:t>
-            </w:r>
-          </w:p>
-        </w:tc>
-        <w:tc>
-          <w:tcPr>
-            <w:tcW w:type="dxa" w:w="1584"/>
-            <w:shd w:fill="1F3A52"/>
-            <w:tcMar>
-              <w:top w:w="50" w:type="dxa"/>
-              <w:bottom w:w="50" w:type="dxa"/>
-              <w:left w:w="50" w:type="dxa"/>
-              <w:right w:w="50" w:type="dxa"/>
-            </w:tcMar>
-          </w:tcPr>
-          <w:p>
-            <w:pPr>
-              <w:spacing w:before="0" w:after="0" w:line="240" w:lineRule="auto"/>
-              <w:jc w:val="right"/>
-            </w:pPr>
-            <w:r>
-              <w:rPr>
-                <w:rFonts w:ascii="Old Standard TT" w:hAnsi="Old Standard TT"/>
-                <w:b/>
-                <w:color w:val="FFFFFF"/>
-                <w:sz w:val="14"/>
-              </w:rPr>
-              <w:t>PNI Top-1 Acc.</w:t>
-            </w:r>
-          </w:p>
-        </w:tc>
-        <w:tc>
-          <w:tcPr>
-            <w:tcW w:type="dxa" w:w="1584"/>
-            <w:shd w:fill="1F3A52"/>
-            <w:tcMar>
-              <w:top w:w="50" w:type="dxa"/>
-              <w:bottom w:w="50" w:type="dxa"/>
-              <w:left w:w="50" w:type="dxa"/>
-              <w:right w:w="50" w:type="dxa"/>
-            </w:tcMar>
-          </w:tcPr>
-          <w:p>
-            <w:pPr>
-              <w:spacing w:before="0" w:after="0" w:line="240" w:lineRule="auto"/>
-              <w:jc w:val="right"/>
-            </w:pPr>
-            <w:r>
-              <w:rPr>
-                <w:rFonts w:ascii="Old Standard TT" w:hAnsi="Old Standard TT"/>
-                <w:b/>
-                <w:color w:val="FFFFFF"/>
-                <w:sz w:val="14"/>
-              </w:rPr>
-              <w:t>PNI FPR</w:t>
+                <w:sz w:val="13"/>
+              </w:rPr>
+              <w:t>PNI FPR [Counts]</w:t>
             </w:r>
           </w:p>
         </w:tc>
@@ -1617,7 +1617,7 @@
         </w:trPr>
         <w:tc>
           <w:tcPr>
-            <w:tcW w:type="dxa" w:w="1584"/>
+            <w:tcW w:type="dxa" w:w="1656"/>
             <w:shd w:fill="FFFFFF"/>
             <w:tcMar>
               <w:top w:w="30" w:type="dxa"/>
@@ -1635,9 +1635,113 @@
               <w:rPr>
                 <w:rFonts w:ascii="Old Standard TT" w:hAnsi="Old Standard TT"/>
                 <w:color w:val="222222"/>
-                <w:sz w:val="14"/>
-              </w:rPr>
-              <w:t>A (Indep.)</w:t>
+                <w:sz w:val="13"/>
+              </w:rPr>
+              <w:t>A (Cal., n=5)</w:t>
+            </w:r>
+          </w:p>
+        </w:tc>
+        <w:tc>
+          <w:tcPr>
+            <w:tcW w:type="dxa" w:w="1368"/>
+            <w:shd w:fill="FFFFFF"/>
+            <w:tcMar>
+              <w:top w:w="30" w:type="dxa"/>
+              <w:bottom w:w="30" w:type="dxa"/>
+              <w:left w:w="50" w:type="dxa"/>
+              <w:right w:w="50" w:type="dxa"/>
+            </w:tcMar>
+          </w:tcPr>
+          <w:p>
+            <w:pPr>
+              <w:spacing w:before="0" w:after="0" w:line="240" w:lineRule="auto"/>
+              <w:jc w:val="right"/>
+            </w:pPr>
+            <w:r>
+              <w:rPr>
+                <w:rFonts w:ascii="Old Standard TT" w:hAnsi="Old Standard TT"/>
+                <w:color w:val="222222"/>
+                <w:sz w:val="13"/>
+              </w:rPr>
+              <w:t>0.027 [0.019, 0.036]</w:t>
+            </w:r>
+          </w:p>
+        </w:tc>
+        <w:tc>
+          <w:tcPr>
+            <w:tcW w:type="dxa" w:w="1512"/>
+            <w:shd w:fill="FFFFFF"/>
+            <w:tcMar>
+              <w:top w:w="30" w:type="dxa"/>
+              <w:bottom w:w="30" w:type="dxa"/>
+              <w:left w:w="50" w:type="dxa"/>
+              <w:right w:w="50" w:type="dxa"/>
+            </w:tcMar>
+          </w:tcPr>
+          <w:p>
+            <w:pPr>
+              <w:spacing w:before="0" w:after="0" w:line="240" w:lineRule="auto"/>
+              <w:jc w:val="right"/>
+            </w:pPr>
+            <w:r>
+              <w:rPr>
+                <w:rFonts w:ascii="Old Standard TT" w:hAnsi="Old Standard TT"/>
+                <w:color w:val="222222"/>
+                <w:sz w:val="13"/>
+              </w:rPr>
+              <w:t>0.067 [0.000, 0.133] (2/30)</w:t>
+            </w:r>
+          </w:p>
+        </w:tc>
+        <w:tc>
+          <w:tcPr>
+            <w:tcW w:type="dxa" w:w="1368"/>
+            <w:shd w:fill="FFFFFF"/>
+            <w:tcMar>
+              <w:top w:w="30" w:type="dxa"/>
+              <w:bottom w:w="30" w:type="dxa"/>
+              <w:left w:w="50" w:type="dxa"/>
+              <w:right w:w="50" w:type="dxa"/>
+            </w:tcMar>
+          </w:tcPr>
+          <w:p>
+            <w:pPr>
+              <w:spacing w:before="0" w:after="0" w:line="240" w:lineRule="auto"/>
+              <w:jc w:val="right"/>
+            </w:pPr>
+            <w:r>
+              <w:rPr>
+                <w:rFonts w:ascii="Old Standard TT" w:hAnsi="Old Standard TT"/>
+                <w:color w:val="222222"/>
+                <w:sz w:val="13"/>
+              </w:rPr>
+              <w:t>0.115 [0.111, 0.118]</w:t>
+            </w:r>
+          </w:p>
+        </w:tc>
+        <w:tc>
+          <w:tcPr>
+            <w:tcW w:type="dxa" w:w="1512"/>
+            <w:shd w:fill="FFFFFF"/>
+            <w:tcMar>
+              <w:top w:w="30" w:type="dxa"/>
+              <w:bottom w:w="30" w:type="dxa"/>
+              <w:left w:w="50" w:type="dxa"/>
+              <w:right w:w="50" w:type="dxa"/>
+            </w:tcMar>
+          </w:tcPr>
+          <w:p>
+            <w:pPr>
+              <w:spacing w:before="0" w:after="0" w:line="240" w:lineRule="auto"/>
+              <w:jc w:val="right"/>
+            </w:pPr>
+            <w:r>
+              <w:rPr>
+                <w:rFonts w:ascii="Old Standard TT" w:hAnsi="Old Standard TT"/>
+                <w:color w:val="222222"/>
+                <w:sz w:val="13"/>
+              </w:rPr>
+              <w:t>0.067 [0.000, 0.133] (2/30)</w:t>
             </w:r>
           </w:p>
         </w:tc>
@@ -1661,111 +1765,7 @@
               <w:rPr>
                 <w:rFonts w:ascii="Old Standard TT" w:hAnsi="Old Standard TT"/>
                 <w:color w:val="222222"/>
-                <w:sz w:val="14"/>
-              </w:rPr>
-              <w:t>0.025 ± 0.003</w:t>
-            </w:r>
-          </w:p>
-        </w:tc>
-        <w:tc>
-          <w:tcPr>
-            <w:tcW w:type="dxa" w:w="1584"/>
-            <w:shd w:fill="FFFFFF"/>
-            <w:tcMar>
-              <w:top w:w="30" w:type="dxa"/>
-              <w:bottom w:w="30" w:type="dxa"/>
-              <w:left w:w="50" w:type="dxa"/>
-              <w:right w:w="50" w:type="dxa"/>
-            </w:tcMar>
-          </w:tcPr>
-          <w:p>
-            <w:pPr>
-              <w:spacing w:before="0" w:after="0" w:line="240" w:lineRule="auto"/>
-              <w:jc w:val="right"/>
-            </w:pPr>
-            <w:r>
-              <w:rPr>
-                <w:rFonts w:ascii="Old Standard TT" w:hAnsi="Old Standard TT"/>
-                <w:color w:val="222222"/>
-                <w:sz w:val="14"/>
-              </w:rPr>
-              <w:t>0.000 [0.000, 0.030]</w:t>
-            </w:r>
-          </w:p>
-        </w:tc>
-        <w:tc>
-          <w:tcPr>
-            <w:tcW w:type="dxa" w:w="1440"/>
-            <w:shd w:fill="FFFFFF"/>
-            <w:tcMar>
-              <w:top w:w="30" w:type="dxa"/>
-              <w:bottom w:w="30" w:type="dxa"/>
-              <w:left w:w="50" w:type="dxa"/>
-              <w:right w:w="50" w:type="dxa"/>
-            </w:tcMar>
-          </w:tcPr>
-          <w:p>
-            <w:pPr>
-              <w:spacing w:before="0" w:after="0" w:line="240" w:lineRule="auto"/>
-              <w:jc w:val="right"/>
-            </w:pPr>
-            <w:r>
-              <w:rPr>
-                <w:rFonts w:ascii="Old Standard TT" w:hAnsi="Old Standard TT"/>
-                <w:color w:val="222222"/>
-                <w:sz w:val="14"/>
-              </w:rPr>
-              <w:t>0.076 ± 0.003</w:t>
-            </w:r>
-          </w:p>
-        </w:tc>
-        <w:tc>
-          <w:tcPr>
-            <w:tcW w:type="dxa" w:w="1584"/>
-            <w:shd w:fill="FFFFFF"/>
-            <w:tcMar>
-              <w:top w:w="30" w:type="dxa"/>
-              <w:bottom w:w="30" w:type="dxa"/>
-              <w:left w:w="50" w:type="dxa"/>
-              <w:right w:w="50" w:type="dxa"/>
-            </w:tcMar>
-          </w:tcPr>
-          <w:p>
-            <w:pPr>
-              <w:spacing w:before="0" w:after="0" w:line="240" w:lineRule="auto"/>
-              <w:jc w:val="right"/>
-            </w:pPr>
-            <w:r>
-              <w:rPr>
-                <w:rFonts w:ascii="Old Standard TT" w:hAnsi="Old Standard TT"/>
-                <w:color w:val="222222"/>
-                <w:sz w:val="14"/>
-              </w:rPr>
-              <w:t>0.050 [0.021, 0.103]</w:t>
-            </w:r>
-          </w:p>
-        </w:tc>
-        <w:tc>
-          <w:tcPr>
-            <w:tcW w:type="dxa" w:w="1584"/>
-            <w:shd w:fill="FFFFFF"/>
-            <w:tcMar>
-              <w:top w:w="30" w:type="dxa"/>
-              <w:bottom w:w="30" w:type="dxa"/>
-              <w:left w:w="50" w:type="dxa"/>
-              <w:right w:w="50" w:type="dxa"/>
-            </w:tcMar>
-          </w:tcPr>
-          <w:p>
-            <w:pPr>
-              <w:spacing w:before="0" w:after="0" w:line="240" w:lineRule="auto"/>
-              <w:jc w:val="right"/>
-            </w:pPr>
-            <w:r>
-              <w:rPr>
-                <w:rFonts w:ascii="Old Standard TT" w:hAnsi="Old Standard TT"/>
-                <w:color w:val="222222"/>
-                <w:sz w:val="14"/>
+                <w:sz w:val="13"/>
               </w:rPr>
               <w:t>N/A</w:t>
             </w:r>
@@ -1773,27 +1773,27 @@
         </w:tc>
         <w:tc>
           <w:tcPr>
-            <w:tcW w:type="dxa" w:w="1584"/>
-            <w:shd w:fill="FFFFFF"/>
-            <w:tcMar>
-              <w:top w:w="30" w:type="dxa"/>
-              <w:bottom w:w="30" w:type="dxa"/>
-              <w:left w:w="50" w:type="dxa"/>
-              <w:right w:w="50" w:type="dxa"/>
-            </w:tcMar>
-          </w:tcPr>
-          <w:p>
-            <w:pPr>
-              <w:spacing w:before="0" w:after="0" w:line="240" w:lineRule="auto"/>
-              <w:jc w:val="right"/>
-            </w:pPr>
-            <w:r>
-              <w:rPr>
-                <w:rFonts w:ascii="Old Standard TT" w:hAnsi="Old Standard TT"/>
-                <w:color w:val="222222"/>
-                <w:sz w:val="14"/>
-              </w:rPr>
-              <w:t>0.050 [0.021, 0.103]</w:t>
+            <w:tcW w:type="dxa" w:w="1368"/>
+            <w:shd w:fill="FFFFFF"/>
+            <w:tcMar>
+              <w:top w:w="30" w:type="dxa"/>
+              <w:bottom w:w="30" w:type="dxa"/>
+              <w:left w:w="50" w:type="dxa"/>
+              <w:right w:w="50" w:type="dxa"/>
+            </w:tcMar>
+          </w:tcPr>
+          <w:p>
+            <w:pPr>
+              <w:spacing w:before="0" w:after="0" w:line="240" w:lineRule="auto"/>
+              <w:jc w:val="right"/>
+            </w:pPr>
+            <w:r>
+              <w:rPr>
+                <w:rFonts w:ascii="Old Standard TT" w:hAnsi="Old Standard TT"/>
+                <w:color w:val="222222"/>
+                <w:sz w:val="13"/>
+              </w:rPr>
+              <w:t>0.067 [0.000, 0.133] (2/30)</w:t>
             </w:r>
           </w:p>
         </w:tc>
@@ -1804,7 +1804,7 @@
         </w:trPr>
         <w:tc>
           <w:tcPr>
-            <w:tcW w:type="dxa" w:w="1584"/>
+            <w:tcW w:type="dxa" w:w="1656"/>
             <w:shd w:fill="F7F9FA"/>
             <w:tcMar>
               <w:top w:w="30" w:type="dxa"/>
@@ -1822,9 +1822,113 @@
               <w:rPr>
                 <w:rFonts w:ascii="Old Standard TT" w:hAnsi="Old Standard TT"/>
                 <w:color w:val="222222"/>
-                <w:sz w:val="14"/>
-              </w:rPr>
-              <w:t>B (Confound)</w:t>
+                <w:sz w:val="13"/>
+              </w:rPr>
+              <w:t>A (Test, n=15)</w:t>
+            </w:r>
+          </w:p>
+        </w:tc>
+        <w:tc>
+          <w:tcPr>
+            <w:tcW w:type="dxa" w:w="1368"/>
+            <w:shd w:fill="F7F9FA"/>
+            <w:tcMar>
+              <w:top w:w="30" w:type="dxa"/>
+              <w:bottom w:w="30" w:type="dxa"/>
+              <w:left w:w="50" w:type="dxa"/>
+              <w:right w:w="50" w:type="dxa"/>
+            </w:tcMar>
+          </w:tcPr>
+          <w:p>
+            <w:pPr>
+              <w:spacing w:before="0" w:after="0" w:line="240" w:lineRule="auto"/>
+              <w:jc w:val="right"/>
+            </w:pPr>
+            <w:r>
+              <w:rPr>
+                <w:rFonts w:ascii="Old Standard TT" w:hAnsi="Old Standard TT"/>
+                <w:color w:val="222222"/>
+                <w:sz w:val="13"/>
+              </w:rPr>
+              <w:t>0.025 [0.020, 0.031]</w:t>
+            </w:r>
+          </w:p>
+        </w:tc>
+        <w:tc>
+          <w:tcPr>
+            <w:tcW w:type="dxa" w:w="1512"/>
+            <w:shd w:fill="F7F9FA"/>
+            <w:tcMar>
+              <w:top w:w="30" w:type="dxa"/>
+              <w:bottom w:w="30" w:type="dxa"/>
+              <w:left w:w="50" w:type="dxa"/>
+              <w:right w:w="50" w:type="dxa"/>
+            </w:tcMar>
+          </w:tcPr>
+          <w:p>
+            <w:pPr>
+              <w:spacing w:before="0" w:after="0" w:line="240" w:lineRule="auto"/>
+              <w:jc w:val="right"/>
+            </w:pPr>
+            <w:r>
+              <w:rPr>
+                <w:rFonts w:ascii="Old Standard TT" w:hAnsi="Old Standard TT"/>
+                <w:color w:val="222222"/>
+                <w:sz w:val="13"/>
+              </w:rPr>
+              <w:t>0.033 [0.000, 0.067] (3/90)</w:t>
+            </w:r>
+          </w:p>
+        </w:tc>
+        <w:tc>
+          <w:tcPr>
+            <w:tcW w:type="dxa" w:w="1368"/>
+            <w:shd w:fill="F7F9FA"/>
+            <w:tcMar>
+              <w:top w:w="30" w:type="dxa"/>
+              <w:bottom w:w="30" w:type="dxa"/>
+              <w:left w:w="50" w:type="dxa"/>
+              <w:right w:w="50" w:type="dxa"/>
+            </w:tcMar>
+          </w:tcPr>
+          <w:p>
+            <w:pPr>
+              <w:spacing w:before="0" w:after="0" w:line="240" w:lineRule="auto"/>
+              <w:jc w:val="right"/>
+            </w:pPr>
+            <w:r>
+              <w:rPr>
+                <w:rFonts w:ascii="Old Standard TT" w:hAnsi="Old Standard TT"/>
+                <w:color w:val="222222"/>
+                <w:sz w:val="13"/>
+              </w:rPr>
+              <w:t>0.115 [0.111, 0.119]</w:t>
+            </w:r>
+          </w:p>
+        </w:tc>
+        <w:tc>
+          <w:tcPr>
+            <w:tcW w:type="dxa" w:w="1512"/>
+            <w:shd w:fill="F7F9FA"/>
+            <w:tcMar>
+              <w:top w:w="30" w:type="dxa"/>
+              <w:bottom w:w="30" w:type="dxa"/>
+              <w:left w:w="50" w:type="dxa"/>
+              <w:right w:w="50" w:type="dxa"/>
+            </w:tcMar>
+          </w:tcPr>
+          <w:p>
+            <w:pPr>
+              <w:spacing w:before="0" w:after="0" w:line="240" w:lineRule="auto"/>
+              <w:jc w:val="right"/>
+            </w:pPr>
+            <w:r>
+              <w:rPr>
+                <w:rFonts w:ascii="Old Standard TT" w:hAnsi="Old Standard TT"/>
+                <w:color w:val="222222"/>
+                <w:sz w:val="13"/>
+              </w:rPr>
+              <w:t>0.111 [0.044, 0.189] (10/90)</w:t>
             </w:r>
           </w:p>
         </w:tc>
@@ -1848,113 +1952,7 @@
               <w:rPr>
                 <w:rFonts w:ascii="Old Standard TT" w:hAnsi="Old Standard TT"/>
                 <w:color w:val="222222"/>
-                <w:sz w:val="14"/>
-              </w:rPr>
-              <w:t>0.958 ± 0.012</w:t>
-            </w:r>
-          </w:p>
-        </w:tc>
-        <w:tc>
-          <w:tcPr>
-            <w:tcW w:type="dxa" w:w="1584"/>
-            <w:shd w:fill="F7F9FA"/>
-            <w:tcMar>
-              <w:top w:w="30" w:type="dxa"/>
-              <w:bottom w:w="30" w:type="dxa"/>
-              <w:left w:w="50" w:type="dxa"/>
-              <w:right w:w="50" w:type="dxa"/>
-            </w:tcMar>
-          </w:tcPr>
-          <w:p>
-            <w:pPr>
-              <w:spacing w:before="0" w:after="0" w:line="240" w:lineRule="auto"/>
-              <w:jc w:val="right"/>
-            </w:pPr>
-            <w:r>
-              <w:rPr>
-                <w:rFonts w:ascii="Old Standard TT" w:hAnsi="Old Standard TT"/>
-                <w:b/>
-                <w:color w:val="222222"/>
-                <w:sz w:val="14"/>
-              </w:rPr>
-              <w:t>**1.000 [0.970, 1.000]**</w:t>
-            </w:r>
-          </w:p>
-        </w:tc>
-        <w:tc>
-          <w:tcPr>
-            <w:tcW w:type="dxa" w:w="1440"/>
-            <w:shd w:fill="F7F9FA"/>
-            <w:tcMar>
-              <w:top w:w="30" w:type="dxa"/>
-              <w:bottom w:w="30" w:type="dxa"/>
-              <w:left w:w="50" w:type="dxa"/>
-              <w:right w:w="50" w:type="dxa"/>
-            </w:tcMar>
-          </w:tcPr>
-          <w:p>
-            <w:pPr>
-              <w:spacing w:before="0" w:after="0" w:line="240" w:lineRule="auto"/>
-              <w:jc w:val="right"/>
-            </w:pPr>
-            <w:r>
-              <w:rPr>
-                <w:rFonts w:ascii="Old Standard TT" w:hAnsi="Old Standard TT"/>
-                <w:color w:val="222222"/>
-                <w:sz w:val="14"/>
-              </w:rPr>
-              <w:t>0.084 ± 0.004</w:t>
-            </w:r>
-          </w:p>
-        </w:tc>
-        <w:tc>
-          <w:tcPr>
-            <w:tcW w:type="dxa" w:w="1584"/>
-            <w:shd w:fill="F7F9FA"/>
-            <w:tcMar>
-              <w:top w:w="30" w:type="dxa"/>
-              <w:bottom w:w="30" w:type="dxa"/>
-              <w:left w:w="50" w:type="dxa"/>
-              <w:right w:w="50" w:type="dxa"/>
-            </w:tcMar>
-          </w:tcPr>
-          <w:p>
-            <w:pPr>
-              <w:spacing w:before="0" w:after="0" w:line="240" w:lineRule="auto"/>
-              <w:jc w:val="right"/>
-            </w:pPr>
-            <w:r>
-              <w:rPr>
-                <w:rFonts w:ascii="Old Standard TT" w:hAnsi="Old Standard TT"/>
-                <w:b/>
-                <w:color w:val="222222"/>
-                <w:sz w:val="14"/>
-              </w:rPr>
-              <w:t>**0.000 [0.000, 0.030]**</w:t>
-            </w:r>
-          </w:p>
-        </w:tc>
-        <w:tc>
-          <w:tcPr>
-            <w:tcW w:type="dxa" w:w="1584"/>
-            <w:shd w:fill="F7F9FA"/>
-            <w:tcMar>
-              <w:top w:w="30" w:type="dxa"/>
-              <w:bottom w:w="30" w:type="dxa"/>
-              <w:left w:w="50" w:type="dxa"/>
-              <w:right w:w="50" w:type="dxa"/>
-            </w:tcMar>
-          </w:tcPr>
-          <w:p>
-            <w:pPr>
-              <w:spacing w:before="0" w:after="0" w:line="240" w:lineRule="auto"/>
-              <w:jc w:val="right"/>
-            </w:pPr>
-            <w:r>
-              <w:rPr>
-                <w:rFonts w:ascii="Old Standard TT" w:hAnsi="Old Standard TT"/>
-                <w:color w:val="222222"/>
-                <w:sz w:val="14"/>
+                <w:sz w:val="13"/>
               </w:rPr>
               <w:t>N/A</w:t>
             </w:r>
@@ -1962,27 +1960,27 @@
         </w:tc>
         <w:tc>
           <w:tcPr>
-            <w:tcW w:type="dxa" w:w="1584"/>
-            <w:shd w:fill="F7F9FA"/>
-            <w:tcMar>
-              <w:top w:w="30" w:type="dxa"/>
-              <w:bottom w:w="30" w:type="dxa"/>
-              <w:left w:w="50" w:type="dxa"/>
-              <w:right w:w="50" w:type="dxa"/>
-            </w:tcMar>
-          </w:tcPr>
-          <w:p>
-            <w:pPr>
-              <w:spacing w:before="0" w:after="0" w:line="240" w:lineRule="auto"/>
-              <w:jc w:val="right"/>
-            </w:pPr>
-            <w:r>
-              <w:rPr>
-                <w:rFonts w:ascii="Old Standard TT" w:hAnsi="Old Standard TT"/>
-                <w:color w:val="222222"/>
-                <w:sz w:val="14"/>
-              </w:rPr>
-              <w:t>0.100 [0.055, 0.166]</w:t>
+            <w:tcW w:type="dxa" w:w="1368"/>
+            <w:shd w:fill="F7F9FA"/>
+            <w:tcMar>
+              <w:top w:w="30" w:type="dxa"/>
+              <w:bottom w:w="30" w:type="dxa"/>
+              <w:left w:w="50" w:type="dxa"/>
+              <w:right w:w="50" w:type="dxa"/>
+            </w:tcMar>
+          </w:tcPr>
+          <w:p>
+            <w:pPr>
+              <w:spacing w:before="0" w:after="0" w:line="240" w:lineRule="auto"/>
+              <w:jc w:val="right"/>
+            </w:pPr>
+            <w:r>
+              <w:rPr>
+                <w:rFonts w:ascii="Old Standard TT" w:hAnsi="Old Standard TT"/>
+                <w:color w:val="222222"/>
+                <w:sz w:val="13"/>
+              </w:rPr>
+              <w:t>0.022 [0.000, 0.056] (2/90)</w:t>
             </w:r>
           </w:p>
         </w:tc>
@@ -1993,7 +1991,7 @@
         </w:trPr>
         <w:tc>
           <w:tcPr>
-            <w:tcW w:type="dxa" w:w="1584"/>
+            <w:tcW w:type="dxa" w:w="1656"/>
             <w:shd w:fill="FFFFFF"/>
             <w:tcMar>
               <w:top w:w="30" w:type="dxa"/>
@@ -2011,9 +2009,117 @@
               <w:rPr>
                 <w:rFonts w:ascii="Old Standard TT" w:hAnsi="Old Standard TT"/>
                 <w:color w:val="222222"/>
-                <w:sz w:val="14"/>
-              </w:rPr>
-              <w:t>C (Coord.)</w:t>
+                <w:sz w:val="13"/>
+              </w:rPr>
+              <w:t>B (Confound, n=20)</w:t>
+            </w:r>
+          </w:p>
+        </w:tc>
+        <w:tc>
+          <w:tcPr>
+            <w:tcW w:type="dxa" w:w="1368"/>
+            <w:shd w:fill="FFFFFF"/>
+            <w:tcMar>
+              <w:top w:w="30" w:type="dxa"/>
+              <w:bottom w:w="30" w:type="dxa"/>
+              <w:left w:w="50" w:type="dxa"/>
+              <w:right w:w="50" w:type="dxa"/>
+            </w:tcMar>
+          </w:tcPr>
+          <w:p>
+            <w:pPr>
+              <w:spacing w:before="0" w:after="0" w:line="240" w:lineRule="auto"/>
+              <w:jc w:val="right"/>
+            </w:pPr>
+            <w:r>
+              <w:rPr>
+                <w:rFonts w:ascii="Old Standard TT" w:hAnsi="Old Standard TT"/>
+                <w:b/>
+                <w:color w:val="222222"/>
+                <w:sz w:val="13"/>
+              </w:rPr>
+              <w:t>**0.958 [0.932, 0.984]**</w:t>
+            </w:r>
+          </w:p>
+        </w:tc>
+        <w:tc>
+          <w:tcPr>
+            <w:tcW w:type="dxa" w:w="1512"/>
+            <w:shd w:fill="FFFFFF"/>
+            <w:tcMar>
+              <w:top w:w="30" w:type="dxa"/>
+              <w:bottom w:w="30" w:type="dxa"/>
+              <w:left w:w="50" w:type="dxa"/>
+              <w:right w:w="50" w:type="dxa"/>
+            </w:tcMar>
+          </w:tcPr>
+          <w:p>
+            <w:pPr>
+              <w:spacing w:before="0" w:after="0" w:line="240" w:lineRule="auto"/>
+              <w:jc w:val="right"/>
+            </w:pPr>
+            <w:r>
+              <w:rPr>
+                <w:rFonts w:ascii="Old Standard TT" w:hAnsi="Old Standard TT"/>
+                <w:b/>
+                <w:color w:val="222222"/>
+                <w:sz w:val="13"/>
+              </w:rPr>
+              <w:t>**1.000 [1.000, 1.000]*** (120/120)</w:t>
+            </w:r>
+          </w:p>
+        </w:tc>
+        <w:tc>
+          <w:tcPr>
+            <w:tcW w:type="dxa" w:w="1368"/>
+            <w:shd w:fill="FFFFFF"/>
+            <w:tcMar>
+              <w:top w:w="30" w:type="dxa"/>
+              <w:bottom w:w="30" w:type="dxa"/>
+              <w:left w:w="50" w:type="dxa"/>
+              <w:right w:w="50" w:type="dxa"/>
+            </w:tcMar>
+          </w:tcPr>
+          <w:p>
+            <w:pPr>
+              <w:spacing w:before="0" w:after="0" w:line="240" w:lineRule="auto"/>
+              <w:jc w:val="right"/>
+            </w:pPr>
+            <w:r>
+              <w:rPr>
+                <w:rFonts w:ascii="Old Standard TT" w:hAnsi="Old Standard TT"/>
+                <w:b/>
+                <w:color w:val="222222"/>
+                <w:sz w:val="13"/>
+              </w:rPr>
+              <w:t>**0.084 [0.081, 0.087]**</w:t>
+            </w:r>
+          </w:p>
+        </w:tc>
+        <w:tc>
+          <w:tcPr>
+            <w:tcW w:type="dxa" w:w="1512"/>
+            <w:shd w:fill="FFFFFF"/>
+            <w:tcMar>
+              <w:top w:w="30" w:type="dxa"/>
+              <w:bottom w:w="30" w:type="dxa"/>
+              <w:left w:w="50" w:type="dxa"/>
+              <w:right w:w="50" w:type="dxa"/>
+            </w:tcMar>
+          </w:tcPr>
+          <w:p>
+            <w:pPr>
+              <w:spacing w:before="0" w:after="0" w:line="240" w:lineRule="auto"/>
+              <w:jc w:val="right"/>
+            </w:pPr>
+            <w:r>
+              <w:rPr>
+                <w:rFonts w:ascii="Old Standard TT" w:hAnsi="Old Standard TT"/>
+                <w:b/>
+                <w:color w:val="222222"/>
+                <w:sz w:val="13"/>
+              </w:rPr>
+              <w:t>**0.000 [0.000, 0.000]*** (0/120)</w:t>
             </w:r>
           </w:p>
         </w:tc>
@@ -2037,94 +2143,177 @@
               <w:rPr>
                 <w:rFonts w:ascii="Old Standard TT" w:hAnsi="Old Standard TT"/>
                 <w:color w:val="222222"/>
-                <w:sz w:val="14"/>
-              </w:rPr>
-              <w:t>0.998 ± 0.009</w:t>
-            </w:r>
-          </w:p>
-        </w:tc>
-        <w:tc>
-          <w:tcPr>
-            <w:tcW w:type="dxa" w:w="1584"/>
-            <w:shd w:fill="FFFFFF"/>
-            <w:tcMar>
-              <w:top w:w="30" w:type="dxa"/>
-              <w:bottom w:w="30" w:type="dxa"/>
-              <w:left w:w="50" w:type="dxa"/>
-              <w:right w:w="50" w:type="dxa"/>
-            </w:tcMar>
-          </w:tcPr>
-          <w:p>
-            <w:pPr>
-              <w:spacing w:before="0" w:after="0" w:line="240" w:lineRule="auto"/>
-              <w:jc w:val="right"/>
-            </w:pPr>
-            <w:r>
-              <w:rPr>
-                <w:rFonts w:ascii="Old Standard TT" w:hAnsi="Old Standard TT"/>
-                <w:color w:val="222222"/>
-                <w:sz w:val="14"/>
-              </w:rPr>
-              <w:t>1.000 [0.970, 1.000]</w:t>
+                <w:sz w:val="13"/>
+              </w:rPr>
+              <w:t>N/A</w:t>
+            </w:r>
+          </w:p>
+        </w:tc>
+        <w:tc>
+          <w:tcPr>
+            <w:tcW w:type="dxa" w:w="1368"/>
+            <w:shd w:fill="FFFFFF"/>
+            <w:tcMar>
+              <w:top w:w="30" w:type="dxa"/>
+              <w:bottom w:w="30" w:type="dxa"/>
+              <w:left w:w="50" w:type="dxa"/>
+              <w:right w:w="50" w:type="dxa"/>
+            </w:tcMar>
+          </w:tcPr>
+          <w:p>
+            <w:pPr>
+              <w:spacing w:before="0" w:after="0" w:line="240" w:lineRule="auto"/>
+              <w:jc w:val="right"/>
+            </w:pPr>
+            <w:r>
+              <w:rPr>
+                <w:rFonts w:ascii="Old Standard TT" w:hAnsi="Old Standard TT"/>
+                <w:color w:val="222222"/>
+                <w:sz w:val="13"/>
+              </w:rPr>
+              <w:t>0.100 [0.050, 0.158] (12/120)</w:t>
+            </w:r>
+          </w:p>
+        </w:tc>
+      </w:tr>
+      <w:tr>
+        <w:trPr>
+          <w:cantSplit/>
+        </w:trPr>
+        <w:tc>
+          <w:tcPr>
+            <w:tcW w:type="dxa" w:w="1656"/>
+            <w:shd w:fill="F7F9FA"/>
+            <w:tcMar>
+              <w:top w:w="30" w:type="dxa"/>
+              <w:bottom w:w="30" w:type="dxa"/>
+              <w:left w:w="50" w:type="dxa"/>
+              <w:right w:w="50" w:type="dxa"/>
+            </w:tcMar>
+          </w:tcPr>
+          <w:p>
+            <w:pPr>
+              <w:spacing w:before="0" w:after="0" w:line="240" w:lineRule="auto"/>
+              <w:jc w:val="left"/>
+            </w:pPr>
+            <w:r>
+              <w:rPr>
+                <w:rFonts w:ascii="Old Standard TT" w:hAnsi="Old Standard TT"/>
+                <w:color w:val="222222"/>
+                <w:sz w:val="13"/>
+              </w:rPr>
+              <w:t>C (Coord., n=20)</w:t>
+            </w:r>
+          </w:p>
+        </w:tc>
+        <w:tc>
+          <w:tcPr>
+            <w:tcW w:type="dxa" w:w="1368"/>
+            <w:shd w:fill="F7F9FA"/>
+            <w:tcMar>
+              <w:top w:w="30" w:type="dxa"/>
+              <w:bottom w:w="30" w:type="dxa"/>
+              <w:left w:w="50" w:type="dxa"/>
+              <w:right w:w="50" w:type="dxa"/>
+            </w:tcMar>
+          </w:tcPr>
+          <w:p>
+            <w:pPr>
+              <w:spacing w:before="0" w:after="0" w:line="240" w:lineRule="auto"/>
+              <w:jc w:val="right"/>
+            </w:pPr>
+            <w:r>
+              <w:rPr>
+                <w:rFonts w:ascii="Old Standard TT" w:hAnsi="Old Standard TT"/>
+                <w:color w:val="222222"/>
+                <w:sz w:val="13"/>
+              </w:rPr>
+              <w:t>1.451 [1.447, 1.454]</w:t>
+            </w:r>
+          </w:p>
+        </w:tc>
+        <w:tc>
+          <w:tcPr>
+            <w:tcW w:type="dxa" w:w="1512"/>
+            <w:shd w:fill="F7F9FA"/>
+            <w:tcMar>
+              <w:top w:w="30" w:type="dxa"/>
+              <w:bottom w:w="30" w:type="dxa"/>
+              <w:left w:w="50" w:type="dxa"/>
+              <w:right w:w="50" w:type="dxa"/>
+            </w:tcMar>
+          </w:tcPr>
+          <w:p>
+            <w:pPr>
+              <w:spacing w:before="0" w:after="0" w:line="240" w:lineRule="auto"/>
+              <w:jc w:val="right"/>
+            </w:pPr>
+            <w:r>
+              <w:rPr>
+                <w:rFonts w:ascii="Old Standard TT" w:hAnsi="Old Standard TT"/>
+                <w:color w:val="222222"/>
+                <w:sz w:val="13"/>
+              </w:rPr>
+              <w:t>0.240 [0.200, 0.320] (24/100)</w:t>
+            </w:r>
+          </w:p>
+        </w:tc>
+        <w:tc>
+          <w:tcPr>
+            <w:tcW w:type="dxa" w:w="1368"/>
+            <w:shd w:fill="F7F9FA"/>
+            <w:tcMar>
+              <w:top w:w="30" w:type="dxa"/>
+              <w:bottom w:w="30" w:type="dxa"/>
+              <w:left w:w="50" w:type="dxa"/>
+              <w:right w:w="50" w:type="dxa"/>
+            </w:tcMar>
+          </w:tcPr>
+          <w:p>
+            <w:pPr>
+              <w:spacing w:before="0" w:after="0" w:line="240" w:lineRule="auto"/>
+              <w:jc w:val="right"/>
+            </w:pPr>
+            <w:r>
+              <w:rPr>
+                <w:rFonts w:ascii="Old Standard TT" w:hAnsi="Old Standard TT"/>
+                <w:color w:val="222222"/>
+                <w:sz w:val="13"/>
+              </w:rPr>
+              <w:t>0.797 [0.785, 0.808]</w:t>
+            </w:r>
+          </w:p>
+        </w:tc>
+        <w:tc>
+          <w:tcPr>
+            <w:tcW w:type="dxa" w:w="1512"/>
+            <w:shd w:fill="F7F9FA"/>
+            <w:tcMar>
+              <w:top w:w="30" w:type="dxa"/>
+              <w:bottom w:w="30" w:type="dxa"/>
+              <w:left w:w="50" w:type="dxa"/>
+              <w:right w:w="50" w:type="dxa"/>
+            </w:tcMar>
+          </w:tcPr>
+          <w:p>
+            <w:pPr>
+              <w:spacing w:before="0" w:after="0" w:line="240" w:lineRule="auto"/>
+              <w:jc w:val="right"/>
+            </w:pPr>
+            <w:r>
+              <w:rPr>
+                <w:rFonts w:ascii="Old Standard TT" w:hAnsi="Old Standard TT"/>
+                <w:color w:val="222222"/>
+                <w:sz w:val="13"/>
+              </w:rPr>
+              <w:t>0.020 [0.000, 0.050] (2/100)</w:t>
             </w:r>
           </w:p>
         </w:tc>
         <w:tc>
           <w:tcPr>
             <w:tcW w:type="dxa" w:w="1440"/>
-            <w:shd w:fill="FFFFFF"/>
-            <w:tcMar>
-              <w:top w:w="30" w:type="dxa"/>
-              <w:bottom w:w="30" w:type="dxa"/>
-              <w:left w:w="50" w:type="dxa"/>
-              <w:right w:w="50" w:type="dxa"/>
-            </w:tcMar>
-          </w:tcPr>
-          <w:p>
-            <w:pPr>
-              <w:spacing w:before="0" w:after="0" w:line="240" w:lineRule="auto"/>
-              <w:jc w:val="right"/>
-            </w:pPr>
-            <w:r>
-              <w:rPr>
-                <w:rFonts w:ascii="Old Standard TT" w:hAnsi="Old Standard TT"/>
-                <w:color w:val="222222"/>
-                <w:sz w:val="14"/>
-              </w:rPr>
-              <w:t>0.684 ± 0.008</w:t>
-            </w:r>
-          </w:p>
-        </w:tc>
-        <w:tc>
-          <w:tcPr>
-            <w:tcW w:type="dxa" w:w="1584"/>
-            <w:shd w:fill="FFFFFF"/>
-            <w:tcMar>
-              <w:top w:w="30" w:type="dxa"/>
-              <w:bottom w:w="30" w:type="dxa"/>
-              <w:left w:w="50" w:type="dxa"/>
-              <w:right w:w="50" w:type="dxa"/>
-            </w:tcMar>
-          </w:tcPr>
-          <w:p>
-            <w:pPr>
-              <w:spacing w:before="0" w:after="0" w:line="240" w:lineRule="auto"/>
-              <w:jc w:val="right"/>
-            </w:pPr>
-            <w:r>
-              <w:rPr>
-                <w:rFonts w:ascii="Old Standard TT" w:hAnsi="Old Standard TT"/>
-                <w:color w:val="222222"/>
-                <w:sz w:val="14"/>
-              </w:rPr>
-              <w:t>0.200* (degenerate)</w:t>
-            </w:r>
-          </w:p>
-        </w:tc>
-        <w:tc>
-          <w:tcPr>
-            <w:tcW w:type="dxa" w:w="1584"/>
-            <w:shd w:fill="FFFFFF"/>
+            <w:shd w:fill="F7F9FA"/>
             <w:tcMar>
               <w:top w:w="30" w:type="dxa"/>
               <w:bottom w:w="30" w:type="dxa"/>
@@ -2142,35 +2331,35 @@
                 <w:rFonts w:ascii="Old Standard TT" w:hAnsi="Old Standard TT"/>
                 <w:b/>
                 <w:color w:val="222222"/>
-                <w:sz w:val="14"/>
-              </w:rPr>
-              <w:t>**1.000 [0.839, 1.000]**</w:t>
-            </w:r>
-          </w:p>
-        </w:tc>
-        <w:tc>
-          <w:tcPr>
-            <w:tcW w:type="dxa" w:w="1584"/>
-            <w:shd w:fill="FFFFFF"/>
-            <w:tcMar>
-              <w:top w:w="30" w:type="dxa"/>
-              <w:bottom w:w="30" w:type="dxa"/>
-              <w:left w:w="50" w:type="dxa"/>
-              <w:right w:w="50" w:type="dxa"/>
-            </w:tcMar>
-          </w:tcPr>
-          <w:p>
-            <w:pPr>
-              <w:spacing w:before="0" w:after="0" w:line="240" w:lineRule="auto"/>
-              <w:jc w:val="right"/>
-            </w:pPr>
-            <w:r>
-              <w:rPr>
-                <w:rFonts w:ascii="Old Standard TT" w:hAnsi="Old Standard TT"/>
-                <w:color w:val="222222"/>
-                <w:sz w:val="14"/>
-              </w:rPr>
-              <w:t>0.200* (degenerate)</w:t>
+                <w:sz w:val="13"/>
+              </w:rPr>
+              <w:t>**1.000 [0.839, 1.000]** (20/20)</w:t>
+            </w:r>
+          </w:p>
+        </w:tc>
+        <w:tc>
+          <w:tcPr>
+            <w:tcW w:type="dxa" w:w="1368"/>
+            <w:shd w:fill="F7F9FA"/>
+            <w:tcMar>
+              <w:top w:w="30" w:type="dxa"/>
+              <w:bottom w:w="30" w:type="dxa"/>
+              <w:left w:w="50" w:type="dxa"/>
+              <w:right w:w="50" w:type="dxa"/>
+            </w:tcMar>
+          </w:tcPr>
+          <w:p>
+            <w:pPr>
+              <w:spacing w:before="0" w:after="0" w:line="240" w:lineRule="auto"/>
+              <w:jc w:val="right"/>
+            </w:pPr>
+            <w:r>
+              <w:rPr>
+                <w:rFonts w:ascii="Old Standard TT" w:hAnsi="Old Standard TT"/>
+                <w:color w:val="222222"/>
+                <w:sz w:val="13"/>
+              </w:rPr>
+              <w:t>0.200 [0.200, 0.200]* (20/100)</w:t>
             </w:r>
           </w:p>
         </w:tc>
@@ -2188,7 +2377,7 @@
           <w:color w:val="555555"/>
           <w:sz w:val="15"/>
         </w:rPr>
-        <w:t>Table 2: Canonical benchmark results at T=200 (mean ± std over held-out test seeds, Wilson 95% CI).</w:t>
+        <w:t>Table 2: Canonical benchmark results at T=200 (mean scores with 95% bootstrap CIs; exact Wilson 95% CIs for Top-1; counts show flagged / total negative candidate pairs; *degenerate bootstrap interval).</w:t>
       </w:r>
     </w:p>
     <w:p>
@@ -2198,7 +2387,7 @@
       <w:r>
         <w:drawing>
           <wp:inline>
-            <wp:extent cx="3749039" cy="2343149"/>
+            <wp:extent cx="3520440" cy="2200275"/>
             <wp:docPr id="1" name="Picture 1"/>
             <wp:cNvGraphicFramePr>
               <a:graphicFrameLocks noChangeAspect="1"/>
@@ -2219,7 +2408,7 @@
                   <pic:spPr>
                     <a:xfrm>
                       <a:off x="0" y="0"/>
-                      <a:ext cx="3749039" cy="2343149"/>
+                      <a:ext cx="3520440" cy="2200275"/>
                     </a:xfrm>
                     <a:prstGeom prst="rect"/>
                   </pic:spPr>
@@ -2252,7 +2441,7 @@
       <w:r>
         <w:drawing>
           <wp:inline>
-            <wp:extent cx="3749039" cy="1533698"/>
+            <wp:extent cx="3520440" cy="1440180"/>
             <wp:docPr id="2" name="Picture 2"/>
             <wp:cNvGraphicFramePr>
               <a:graphicFrameLocks noChangeAspect="1"/>
@@ -2273,7 +2462,7 @@
                   <pic:spPr>
                     <a:xfrm>
                       <a:off x="0" y="0"/>
-                      <a:ext cx="3749039" cy="1533698"/>
+                      <a:ext cx="3520440" cy="1440180"/>
                     </a:xfrm>
                     <a:prstGeom prst="rect"/>
                   </pic:spPr>
@@ -2324,7 +2513,7 @@
           <w:rFonts w:ascii="Old Standard TT" w:hAnsi="Old Standard TT"/>
           <w:sz w:val="18"/>
         </w:rPr>
-        <w:t>We deployed Qwen/Qwen2.5-1.5B-Instruct on Modal CPU workers (4 vCPU, 8 GB RAM per container, torch.bfloat16) across 630 game trajectories (68,400 agent decisions) at horizons T in {5, 20, 50}. Across all 68,400 decisions, the JSON parser achieved a 100.0% valid action selection rate without defaulting. In Condition LLM-C, coordinating agents achieved 100.0% adherence to secret coordination directives across all 11,400 opportunities.</w:t>
+        <w:t>We deployed Qwen/Qwen2.5-1.5B-Instruct on Modal CPU workers (4 vCPU, 8 GB RAM per container, torch.bfloat16) across 630 game trajectories (68,400 agent decisions) at horizons T in {5, 20, 50}. Across all 68,400 decisions, the JSON parser achieved a 100.0% valid action selection rate without defaulting. In Condition LLM-C, coordinating agents achieved 100.0% adherence to secret coordination directives across all 11,400 opportunities (400 at T=5; 4,000 at T=20; 7,000 at T=50). Condition LLM-C evaluates instruction compliance with an assigned shared private coordination directive; it does not simulate or claim spontaneous collusion or emergent cartel formation.</w:t>
       </w:r>
     </w:p>
     <w:tbl>
@@ -8235,6 +8424,35 @@
           <w:sz w:val="18"/>
         </w:rPr>
         <w:t xml:space="preserve"> An extensive 68,400-decision study using Qwen/Qwen2.5-1.5B-Instruct was executed on Modal CPU instances (4 cores, 8GB RAM). Allocating cloud GPU instances required an active payment method on file under Modal platform policy, which was safely avoided under our zero-out-of-pocket spending cap ($0.00). The CPU pipeline logged $40.63 in metered compute ($40.12 promotional credits applied, $0.51 network egress allowance; $0.00 billed out of pocket) across 630 trajectories (68,400 decisions).</w:t>
+      </w:r>
+    </w:p>
+    <w:p>
+      <w:pPr>
+        <w:spacing w:line="259" w:lineRule="auto" w:before="0" w:after="30"/>
+        <w:ind w:left="259"/>
+      </w:pPr>
+      <w:r>
+        <w:rPr>
+          <w:rFonts w:ascii="Old Standard TT" w:hAnsi="Old Standard TT"/>
+          <w:b/>
+          <w:sz w:val="18"/>
+        </w:rPr>
+        <w:t xml:space="preserve">• </w:t>
+      </w:r>
+      <w:r>
+        <w:rPr>
+          <w:rFonts w:ascii="Old Standard TT" w:hAnsi="Old Standard TT"/>
+          <w:b/>
+          <w:sz w:val="18"/>
+        </w:rPr>
+        <w:t>5. Prompted Instruction Adherence vs. Spontaneous Collusion:</w:t>
+      </w:r>
+      <w:r>
+        <w:rPr>
+          <w:rFonts w:ascii="Old Standard TT" w:hAnsi="Old Standard TT"/>
+          <w:sz w:val="18"/>
+        </w:rPr>
+        <w:t xml:space="preserve"> In Condition LLM-C, models are explicitly prompted to follow an assigned secret directive Z_t. Perfect signal compliance (100.0%, 11,400/11,400 opportunities) confirms that foundation models reliably adhere to structured coordination instructions in multi-agent game logs, but must not be interpreted as spontaneous collusion emergence or demonstrated market harm. Furthermore, competitor subtraction drives rival net scores negative, requiring careful distinction between relative ranking and absolute threshold detection.</w:t>
       </w:r>
     </w:p>
     <w:p>

</xml_diff>